<commit_message>
Add DOCX to PDF conversion and refactor generation
Introduce XDocReport PDF converter dependency and comprehensively refactor DOCX generation/preview. DocumentGenerationService now uses Apache POI (XWPF) to replace placeholders, handle tables/textboxes, register fonts for Thai, produce in-memory DOCX previews and convert DOCX→PDF. Controllers updated: improved server-side scoring logic, checkbox exclusivity handling, normalized JSON field names, added document-1 endpoints, draft handling and submission flow for applicants, and preview support for doc_4 copy with committee data. Misc: small formatting/cleanup changes, new AdminInitializer class and updated templates/resources.
</commit_message>
<xml_diff>
--- a/shopping-cart-spring-boot-main/src/main/resources/templates/docx/doc_0.docx
+++ b/shopping-cart-spring-boot-main/src/main/resources/templates/docx/doc_0.docx
@@ -203,7 +203,7 @@
           <w:color w:val="000000" w:themeColor="text1"/>
           <w:sz w:val="32"/>
           <w:szCs w:val="32"/>
-          <w:lang w:eastAsia="en-GB"/>
+          <w:lang w:val="en-US" w:eastAsia="en-GB"/>
         </w:rPr>
       </w:pPr>
       <w:r>
@@ -320,9 +320,9 @@
           <w:color w:val="000000" w:themeColor="text1"/>
           <w:sz w:val="32"/>
           <w:szCs w:val="32"/>
-          <w:lang w:eastAsia="en-GB"/>
-        </w:rPr>
-        <w:t>document_number</w:t>
+          <w:lang w:val="en-US" w:eastAsia="en-GB"/>
+        </w:rPr>
+        <w:t>memo_no</w:t>
       </w:r>
       <w:proofErr w:type="spellEnd"/>
       <w:r>
@@ -387,39 +387,18 @@
           <w:szCs w:val="32"/>
           <w:lang w:eastAsia="en-GB"/>
         </w:rPr>
-        <w:t>{{</w:t>
-      </w:r>
-      <w:proofErr w:type="spellStart"/>
-      <w:r>
-        <w:rPr>
-          <w:rFonts w:ascii="TH Sarabun New" w:eastAsia="Times New Roman" w:hAnsi="TH Sarabun New" w:cs="TH Sarabun New"/>
-          <w:color w:val="000000" w:themeColor="text1"/>
-          <w:sz w:val="32"/>
-          <w:szCs w:val="32"/>
-          <w:lang w:eastAsia="en-GB"/>
-        </w:rPr>
-        <w:t>document_date</w:t>
-      </w:r>
-      <w:proofErr w:type="spellEnd"/>
-      <w:r>
-        <w:rPr>
-          <w:rFonts w:ascii="TH Sarabun New" w:eastAsia="Times New Roman" w:hAnsi="TH Sarabun New" w:cs="TH Sarabun New"/>
-          <w:color w:val="000000" w:themeColor="text1"/>
-          <w:sz w:val="32"/>
-          <w:szCs w:val="32"/>
-          <w:lang w:eastAsia="en-GB"/>
-        </w:rPr>
-        <w:t>}}</w:t>
+        <w:t>{{date}}</w:t>
       </w:r>
     </w:p>
     <w:p>
       <w:pPr>
         <w:ind w:left="283" w:right="283"/>
         <w:rPr>
-          <w:rFonts w:ascii="TH Sarabun New" w:eastAsia="Times New Roman" w:hAnsi="TH Sarabun New" w:cs="TH Sarabun New"/>
+          <w:rFonts w:ascii="TH Sarabun New" w:eastAsia="Times New Roman" w:hAnsi="TH Sarabun New" w:cs="TH Sarabun New" w:hint="cs"/>
           <w:color w:val="000000" w:themeColor="text1"/>
           <w:sz w:val="16"/>
           <w:szCs w:val="16"/>
+          <w:cs/>
           <w:lang w:eastAsia="en-GB"/>
         </w:rPr>
       </w:pPr>
@@ -609,6 +588,26 @@
         </w:rPr>
         <w:t>{{</w:t>
       </w:r>
+      <w:r>
+        <w:rPr>
+          <w:rFonts w:ascii="TH Sarabun New" w:eastAsia="Times New Roman" w:hAnsi="TH Sarabun New" w:cs="TH Sarabun New"/>
+          <w:color w:val="000000" w:themeColor="text1"/>
+          <w:sz w:val="32"/>
+          <w:szCs w:val="32"/>
+          <w:lang w:val="en-US" w:eastAsia="en-GB"/>
+        </w:rPr>
+        <w:t>title</w:t>
+      </w:r>
+      <w:r>
+        <w:rPr>
+          <w:rFonts w:ascii="TH Sarabun New" w:eastAsia="Times New Roman" w:hAnsi="TH Sarabun New" w:cs="TH Sarabun New"/>
+          <w:color w:val="000000" w:themeColor="text1"/>
+          <w:sz w:val="32"/>
+          <w:szCs w:val="32"/>
+          <w:lang w:eastAsia="en-GB"/>
+        </w:rPr>
+        <w:t>}}{{</w:t>
+      </w:r>
       <w:proofErr w:type="spellStart"/>
       <w:r>
         <w:rPr>
@@ -618,7 +617,7 @@
           <w:szCs w:val="32"/>
           <w:lang w:eastAsia="en-GB"/>
         </w:rPr>
-        <w:t>applicant_prefix</w:t>
+        <w:t>full_name</w:t>
       </w:r>
       <w:proofErr w:type="spellEnd"/>
       <w:r>
@@ -629,7 +628,28 @@
           <w:szCs w:val="32"/>
           <w:lang w:eastAsia="en-GB"/>
         </w:rPr>
-        <w:t>}}{{</w:t>
+        <w:t>}}</w:t>
+      </w:r>
+      <w:r>
+        <w:rPr>
+          <w:rFonts w:ascii="TH Sarabun New" w:eastAsia="Times New Roman" w:hAnsi="TH Sarabun New" w:cs="TH Sarabun New" w:hint="cs"/>
+          <w:color w:val="000000" w:themeColor="text1"/>
+          <w:sz w:val="32"/>
+          <w:szCs w:val="32"/>
+          <w:cs/>
+          <w:lang w:eastAsia="en-GB"/>
+        </w:rPr>
+        <w:t xml:space="preserve"> </w:t>
+      </w:r>
+      <w:r>
+        <w:rPr>
+          <w:rFonts w:ascii="TH Sarabun New" w:eastAsia="Times New Roman" w:hAnsi="TH Sarabun New" w:cs="TH Sarabun New"/>
+          <w:color w:val="000000" w:themeColor="text1"/>
+          <w:sz w:val="32"/>
+          <w:szCs w:val="32"/>
+          <w:lang w:eastAsia="en-GB"/>
+        </w:rPr>
+        <w:t>{{</w:t>
       </w:r>
       <w:proofErr w:type="spellStart"/>
       <w:r>
@@ -640,7 +660,27 @@
           <w:szCs w:val="32"/>
           <w:lang w:eastAsia="en-GB"/>
         </w:rPr>
-        <w:t>applicant_name</w:t>
+        <w:t>employ</w:t>
+      </w:r>
+      <w:r>
+        <w:rPr>
+          <w:rFonts w:ascii="TH Sarabun New" w:eastAsia="Times New Roman" w:hAnsi="TH Sarabun New" w:cs="TH Sarabun New"/>
+          <w:color w:val="000000" w:themeColor="text1"/>
+          <w:sz w:val="32"/>
+          <w:szCs w:val="32"/>
+          <w:lang w:eastAsia="en-GB"/>
+        </w:rPr>
+        <w:t>ee</w:t>
+      </w:r>
+      <w:r>
+        <w:rPr>
+          <w:rFonts w:ascii="TH Sarabun New" w:eastAsia="Times New Roman" w:hAnsi="TH Sarabun New" w:cs="TH Sarabun New"/>
+          <w:color w:val="000000" w:themeColor="text1"/>
+          <w:sz w:val="32"/>
+          <w:szCs w:val="32"/>
+          <w:lang w:eastAsia="en-GB"/>
+        </w:rPr>
+        <w:t>_type</w:t>
       </w:r>
       <w:proofErr w:type="spellEnd"/>
       <w:r>
@@ -659,13 +699,45 @@
           <w:color w:val="000000" w:themeColor="text1"/>
           <w:sz w:val="32"/>
           <w:szCs w:val="32"/>
-          <w:cs/>
           <w:lang w:eastAsia="en-GB"/>
         </w:rPr>
         <w:t xml:space="preserve"> </w:t>
       </w:r>
       <w:r>
         <w:rPr>
+          <w:rFonts w:ascii="TH Sarabun New" w:eastAsia="Times New Roman" w:hAnsi="TH Sarabun New" w:cs="TH Sarabun New" w:hint="cs"/>
+          <w:color w:val="000000" w:themeColor="text1"/>
+          <w:sz w:val="32"/>
+          <w:szCs w:val="32"/>
+          <w:cs/>
+          <w:lang w:eastAsia="en-GB"/>
+        </w:rPr>
+        <w:t>ประเภท</w:t>
+      </w:r>
+      <w:r>
+        <w:rPr>
+          <w:rFonts w:ascii="TH Sarabun New" w:eastAsia="Times New Roman" w:hAnsi="TH Sarabun New" w:cs="TH Sarabun New" w:hint="cs"/>
+          <w:color w:val="000000" w:themeColor="text1"/>
+          <w:sz w:val="32"/>
+          <w:szCs w:val="32"/>
+          <w:cs/>
+          <w:lang w:eastAsia="en-GB"/>
+        </w:rPr>
+        <w:t xml:space="preserve"> </w:t>
+      </w:r>
+      <w:r>
+        <w:rPr>
+          <w:rFonts w:ascii="TH Sarabun New" w:eastAsia="Times New Roman" w:hAnsi="TH Sarabun New" w:cs="TH Sarabun New" w:hint="cs"/>
+          <w:color w:val="000000" w:themeColor="text1"/>
+          <w:sz w:val="32"/>
+          <w:szCs w:val="32"/>
+          <w:cs/>
+          <w:lang w:eastAsia="en-GB"/>
+        </w:rPr>
+        <w:t xml:space="preserve">วิชาการ ตำแหน่ง </w:t>
+      </w:r>
+      <w:r>
+        <w:rPr>
           <w:rFonts w:ascii="TH Sarabun New" w:eastAsia="Times New Roman" w:hAnsi="TH Sarabun New" w:cs="TH Sarabun New"/>
           <w:color w:val="000000" w:themeColor="text1"/>
           <w:sz w:val="32"/>
@@ -683,82 +755,17 @@
           <w:szCs w:val="32"/>
           <w:lang w:eastAsia="en-GB"/>
         </w:rPr>
-        <w:t>employment_type</w:t>
-      </w:r>
-      <w:proofErr w:type="spellEnd"/>
-      <w:r>
-        <w:rPr>
-          <w:rFonts w:ascii="TH Sarabun New" w:eastAsia="Times New Roman" w:hAnsi="TH Sarabun New" w:cs="TH Sarabun New"/>
-          <w:color w:val="000000" w:themeColor="text1"/>
-          <w:sz w:val="32"/>
-          <w:szCs w:val="32"/>
-          <w:lang w:eastAsia="en-GB"/>
-        </w:rPr>
-        <w:t>}}</w:t>
-      </w:r>
-      <w:r>
-        <w:rPr>
-          <w:rFonts w:ascii="TH Sarabun New" w:eastAsia="Times New Roman" w:hAnsi="TH Sarabun New" w:cs="TH Sarabun New" w:hint="cs"/>
-          <w:color w:val="000000" w:themeColor="text1"/>
-          <w:sz w:val="32"/>
-          <w:szCs w:val="32"/>
-          <w:lang w:eastAsia="en-GB"/>
-        </w:rPr>
-        <w:t xml:space="preserve"> </w:t>
-      </w:r>
-      <w:r>
-        <w:rPr>
-          <w:rFonts w:ascii="TH Sarabun New" w:eastAsia="Times New Roman" w:hAnsi="TH Sarabun New" w:cs="TH Sarabun New" w:hint="cs"/>
-          <w:color w:val="000000" w:themeColor="text1"/>
-          <w:sz w:val="32"/>
-          <w:szCs w:val="32"/>
-          <w:cs/>
-          <w:lang w:eastAsia="en-GB"/>
-        </w:rPr>
-        <w:t>ประเภท</w:t>
-      </w:r>
-      <w:r>
-        <w:rPr>
-          <w:rFonts w:ascii="TH Sarabun New" w:eastAsia="Times New Roman" w:hAnsi="TH Sarabun New" w:cs="TH Sarabun New" w:hint="cs"/>
-          <w:color w:val="000000" w:themeColor="text1"/>
-          <w:sz w:val="32"/>
-          <w:szCs w:val="32"/>
-          <w:cs/>
-          <w:lang w:eastAsia="en-GB"/>
-        </w:rPr>
-        <w:t xml:space="preserve"> </w:t>
-      </w:r>
-      <w:r>
-        <w:rPr>
-          <w:rFonts w:ascii="TH Sarabun New" w:eastAsia="Times New Roman" w:hAnsi="TH Sarabun New" w:cs="TH Sarabun New" w:hint="cs"/>
-          <w:color w:val="000000" w:themeColor="text1"/>
-          <w:sz w:val="32"/>
-          <w:szCs w:val="32"/>
-          <w:cs/>
-          <w:lang w:eastAsia="en-GB"/>
-        </w:rPr>
-        <w:t xml:space="preserve">วิชาการ ตำแหน่ง </w:t>
-      </w:r>
-      <w:r>
-        <w:rPr>
-          <w:rFonts w:ascii="TH Sarabun New" w:eastAsia="Times New Roman" w:hAnsi="TH Sarabun New" w:cs="TH Sarabun New"/>
-          <w:color w:val="000000" w:themeColor="text1"/>
-          <w:sz w:val="32"/>
-          <w:szCs w:val="32"/>
-          <w:lang w:eastAsia="en-GB"/>
-        </w:rPr>
-        <w:t>{{</w:t>
-      </w:r>
-      <w:proofErr w:type="spellStart"/>
-      <w:r>
-        <w:rPr>
-          <w:rFonts w:ascii="TH Sarabun New" w:eastAsia="Times New Roman" w:hAnsi="TH Sarabun New" w:cs="TH Sarabun New"/>
-          <w:color w:val="000000" w:themeColor="text1"/>
-          <w:sz w:val="32"/>
-          <w:szCs w:val="32"/>
-          <w:lang w:eastAsia="en-GB"/>
-        </w:rPr>
-        <w:t>current_academic_rank</w:t>
+        <w:t>current_</w:t>
+      </w:r>
+      <w:r>
+        <w:rPr>
+          <w:rFonts w:ascii="TH Sarabun New" w:eastAsia="Times New Roman" w:hAnsi="TH Sarabun New" w:cs="TH Sarabun New"/>
+          <w:color w:val="000000" w:themeColor="text1"/>
+          <w:sz w:val="32"/>
+          <w:szCs w:val="32"/>
+          <w:lang w:eastAsia="en-GB"/>
+        </w:rPr>
+        <w:t>position</w:t>
       </w:r>
       <w:proofErr w:type="spellEnd"/>
       <w:r>
@@ -2110,7 +2117,6 @@
   <w:style w:type="character" w:default="1" w:styleId="a0">
     <w:name w:val="Default Paragraph Font"/>
     <w:uiPriority w:val="1"/>
-    <w:semiHidden/>
     <w:unhideWhenUsed/>
   </w:style>
   <w:style w:type="table" w:default="1" w:styleId="a1">

</xml_diff>

<commit_message>
Auto-set MEETING_SCHEDULED for Doc 4 and form fixes
Add automatic status update for document type 4: AcademicRequestService now sets RequestStatus.MEETING_SCHEDULED when Doc 4 is saved and the frontend notifyDocTypes list includes 4. Unify applicant name handling across templates by using the applicant_name input (removed a redundant hidden field and adjusted the applicant form input). Update datasource URL to use ecommerce_db1 in application.properties (including target/classes). Add/update various .docx templates and upload assets (new/modified document templates, backups, and profile image).
</commit_message>
<xml_diff>
--- a/shopping-cart-spring-boot-main/src/main/resources/templates/docx/doc_0.docx
+++ b/shopping-cart-spring-boot-main/src/main/resources/templates/docx/doc_0.docx
@@ -381,6 +381,19 @@
       </w:r>
       <w:r>
         <w:rPr>
+          <w:rFonts w:ascii="TH Sarabun New" w:eastAsia="Times New Roman" w:hAnsi="TH Sarabun New" w:cs="TH Sarabun New" w:hint="cs"/>
+          <w:b/>
+          <w:bCs/>
+          <w:color w:val="000000" w:themeColor="text1"/>
+          <w:sz w:val="32"/>
+          <w:szCs w:val="32"/>
+          <w:cs/>
+          <w:lang w:eastAsia="en-GB"/>
+        </w:rPr>
+        <w:t xml:space="preserve"> </w:t>
+      </w:r>
+      <w:r>
+        <w:rPr>
           <w:rFonts w:ascii="TH Sarabun New" w:eastAsia="Times New Roman" w:hAnsi="TH Sarabun New" w:cs="TH Sarabun New"/>
           <w:color w:val="000000" w:themeColor="text1"/>
           <w:sz w:val="32"/>
@@ -394,7 +407,7 @@
       <w:pPr>
         <w:ind w:left="283" w:right="283"/>
         <w:rPr>
-          <w:rFonts w:ascii="TH Sarabun New" w:eastAsia="Times New Roman" w:hAnsi="TH Sarabun New" w:cs="TH Sarabun New" w:hint="cs"/>
+          <w:rFonts w:ascii="TH Sarabun New" w:eastAsia="Times New Roman" w:hAnsi="TH Sarabun New" w:cs="TH Sarabun New"/>
           <w:color w:val="000000" w:themeColor="text1"/>
           <w:sz w:val="16"/>
           <w:szCs w:val="16"/>
@@ -2117,6 +2130,7 @@
   <w:style w:type="character" w:default="1" w:styleId="a0">
     <w:name w:val="Default Paragraph Font"/>
     <w:uiPriority w:val="1"/>
+    <w:semiHidden/>
     <w:unhideWhenUsed/>
   </w:style>
   <w:style w:type="table" w:default="1" w:styleId="a1">

</xml_diff>

<commit_message>
Enable async, handle notify failures
Enable @EnableAsync on the Spring Boot application and add error handling for automatic status/notification updates in AcademicAdminController. If requestService.autoUpdateStatusByDocument throws, the controller now logs the error and redirects with a warn=notify_failed flag; the admin request_detail.html template is updated to display a warning when this flag is present. Also increase server.session timeout from 30m to 60m in application.properties (and target classes), update multiple docx template files (and remove the temporary ~$doc_7.docx), and add several uploaded docx assets under uploads/academic.
</commit_message>
<xml_diff>
--- a/shopping-cart-spring-boot-main/src/main/resources/templates/docx/doc_0.docx
+++ b/shopping-cart-spring-boot-main/src/main/resources/templates/docx/doc_0.docx
@@ -394,7 +394,7 @@
       <w:pPr>
         <w:ind w:left="283" w:right="283"/>
         <w:rPr>
-          <w:rFonts w:ascii="TH Sarabun New" w:eastAsia="Times New Roman" w:hAnsi="TH Sarabun New" w:cs="TH Sarabun New" w:hint="cs"/>
+          <w:rFonts w:ascii="TH Sarabun New" w:eastAsia="Times New Roman" w:hAnsi="TH Sarabun New" w:cs="TH Sarabun New"/>
           <w:color w:val="000000" w:themeColor="text1"/>
           <w:sz w:val="16"/>
           <w:szCs w:val="16"/>
@@ -828,7 +828,7 @@
           <w:cs/>
           <w:lang w:val="en-US" w:eastAsia="en-GB"/>
         </w:rPr>
-        <w:t xml:space="preserve">ผู้ช่วยศาสตราจารย์  </w:t>
+        <w:t xml:space="preserve">ผู้ช่วยศาสตราจารย์ </w:t>
       </w:r>
       <w:r>
         <w:rPr>
@@ -991,7 +991,7 @@
         <w:ind w:firstLine="720"/>
         <w:jc w:val="thaiDistribute"/>
         <w:rPr>
-          <w:rFonts w:ascii="TH Sarabun New" w:eastAsia="Times New Roman" w:hAnsi="TH Sarabun New" w:cs="TH Sarabun New"/>
+          <w:rFonts w:ascii="TH Sarabun New" w:eastAsia="Times New Roman" w:hAnsi="TH Sarabun New" w:cs="TH Sarabun New" w:hint="cs"/>
           <w:color w:val="000000" w:themeColor="text1"/>
           <w:sz w:val="32"/>
           <w:szCs w:val="32"/>
@@ -1019,6 +1019,79 @@
           <w:lang w:val="en-US" w:eastAsia="en-GB"/>
         </w:rPr>
         <w:t>1. แผนการสอน พร้อมเกณฑ์และวิธีวัดประเมินผลของผู้เรียน</w:t>
+      </w:r>
+      <w:r>
+        <w:rPr>
+          <w:rFonts w:ascii="TH Sarabun New" w:eastAsia="Times New Roman" w:hAnsi="TH Sarabun New" w:cs="TH Sarabun New"/>
+          <w:color w:val="000000" w:themeColor="text1"/>
+          <w:sz w:val="32"/>
+          <w:szCs w:val="32"/>
+          <w:lang w:val="en-US" w:eastAsia="en-GB"/>
+        </w:rPr>
+        <w:t xml:space="preserve"> </w:t>
+      </w:r>
+      <w:r>
+        <w:rPr>
+          <w:rFonts w:ascii="TH Sarabun New" w:eastAsia="Times New Roman" w:hAnsi="TH Sarabun New" w:cs="TH Sarabun New" w:hint="cs"/>
+          <w:color w:val="000000" w:themeColor="text1"/>
+          <w:sz w:val="32"/>
+          <w:szCs w:val="32"/>
+          <w:cs/>
+          <w:lang w:val="en-US" w:eastAsia="en-GB"/>
+        </w:rPr>
+        <w:t>รายวิชา</w:t>
+      </w:r>
+      <w:r>
+        <w:rPr>
+          <w:rFonts w:ascii="TH Sarabun New" w:eastAsia="Times New Roman" w:hAnsi="TH Sarabun New" w:cs="TH Sarabun New"/>
+          <w:color w:val="000000" w:themeColor="text1"/>
+          <w:sz w:val="32"/>
+          <w:szCs w:val="32"/>
+          <w:lang w:val="en-US" w:eastAsia="en-GB"/>
+        </w:rPr>
+        <w:t>{{}}</w:t>
+      </w:r>
+      <w:r>
+        <w:rPr>
+          <w:rFonts w:ascii="TH Sarabun New" w:eastAsia="Times New Roman" w:hAnsi="TH Sarabun New" w:cs="TH Sarabun New" w:hint="cs"/>
+          <w:color w:val="000000" w:themeColor="text1"/>
+          <w:sz w:val="32"/>
+          <w:szCs w:val="32"/>
+          <w:cs/>
+          <w:lang w:val="en-US" w:eastAsia="en-GB"/>
+        </w:rPr>
+        <w:t>รหัสวิชา</w:t>
+      </w:r>
+      <w:r>
+        <w:rPr>
+          <w:rFonts w:ascii="TH Sarabun New" w:eastAsia="Times New Roman" w:hAnsi="TH Sarabun New" w:cs="TH Sarabun New"/>
+          <w:color w:val="000000" w:themeColor="text1"/>
+          <w:sz w:val="32"/>
+          <w:szCs w:val="32"/>
+          <w:lang w:val="en-US" w:eastAsia="en-GB"/>
+        </w:rPr>
+        <w:t>{{}}</w:t>
+      </w:r>
+      <w:r>
+        <w:rPr>
+          <w:rFonts w:ascii="TH Sarabun New" w:eastAsia="Times New Roman" w:hAnsi="TH Sarabun New" w:cs="TH Sarabun New" w:hint="cs"/>
+          <w:color w:val="000000" w:themeColor="text1"/>
+          <w:sz w:val="32"/>
+          <w:szCs w:val="32"/>
+          <w:cs/>
+          <w:lang w:val="en-US" w:eastAsia="en-GB"/>
+        </w:rPr>
+        <w:t>ปีการศึกษา</w:t>
+      </w:r>
+      <w:r>
+        <w:rPr>
+          <w:rFonts w:ascii="TH Sarabun New" w:eastAsia="Times New Roman" w:hAnsi="TH Sarabun New" w:cs="TH Sarabun New"/>
+          <w:color w:val="000000" w:themeColor="text1"/>
+          <w:sz w:val="32"/>
+          <w:szCs w:val="32"/>
+          <w:lang w:val="en-US" w:eastAsia="en-GB"/>
+        </w:rPr>
+        <w:t>{{}}</w:t>
       </w:r>
     </w:p>
     <w:p>
@@ -1055,6 +1128,79 @@
         </w:rPr>
         <w:t>2. สาระสำคัญของเนื้อหาวิชาประกอบการบรรยายหรือการจัดกิจกรรมการเรียนรู้</w:t>
       </w:r>
+      <w:r>
+        <w:rPr>
+          <w:rFonts w:ascii="TH Sarabun New" w:eastAsia="Times New Roman" w:hAnsi="TH Sarabun New" w:cs="TH Sarabun New"/>
+          <w:color w:val="000000" w:themeColor="text1"/>
+          <w:sz w:val="32"/>
+          <w:szCs w:val="32"/>
+          <w:lang w:val="en-US" w:eastAsia="en-GB"/>
+        </w:rPr>
+        <w:t xml:space="preserve"> </w:t>
+      </w:r>
+      <w:r>
+        <w:rPr>
+          <w:rFonts w:ascii="TH Sarabun New" w:eastAsia="Times New Roman" w:hAnsi="TH Sarabun New" w:cs="TH Sarabun New" w:hint="cs"/>
+          <w:color w:val="000000" w:themeColor="text1"/>
+          <w:sz w:val="32"/>
+          <w:szCs w:val="32"/>
+          <w:cs/>
+          <w:lang w:val="en-US" w:eastAsia="en-GB"/>
+        </w:rPr>
+        <w:t>รายวิชา</w:t>
+      </w:r>
+      <w:r>
+        <w:rPr>
+          <w:rFonts w:ascii="TH Sarabun New" w:eastAsia="Times New Roman" w:hAnsi="TH Sarabun New" w:cs="TH Sarabun New"/>
+          <w:color w:val="000000" w:themeColor="text1"/>
+          <w:sz w:val="32"/>
+          <w:szCs w:val="32"/>
+          <w:lang w:val="en-US" w:eastAsia="en-GB"/>
+        </w:rPr>
+        <w:t>{{}}</w:t>
+      </w:r>
+      <w:r>
+        <w:rPr>
+          <w:rFonts w:ascii="TH Sarabun New" w:eastAsia="Times New Roman" w:hAnsi="TH Sarabun New" w:cs="TH Sarabun New" w:hint="cs"/>
+          <w:color w:val="000000" w:themeColor="text1"/>
+          <w:sz w:val="32"/>
+          <w:szCs w:val="32"/>
+          <w:cs/>
+          <w:lang w:val="en-US" w:eastAsia="en-GB"/>
+        </w:rPr>
+        <w:t>รหัสวิชา</w:t>
+      </w:r>
+      <w:r>
+        <w:rPr>
+          <w:rFonts w:ascii="TH Sarabun New" w:eastAsia="Times New Roman" w:hAnsi="TH Sarabun New" w:cs="TH Sarabun New"/>
+          <w:color w:val="000000" w:themeColor="text1"/>
+          <w:sz w:val="32"/>
+          <w:szCs w:val="32"/>
+          <w:lang w:val="en-US" w:eastAsia="en-GB"/>
+        </w:rPr>
+        <w:t>{{}}</w:t>
+      </w:r>
+      <w:r>
+        <w:rPr>
+          <w:rFonts w:ascii="TH Sarabun New" w:eastAsia="Times New Roman" w:hAnsi="TH Sarabun New" w:cs="TH Sarabun New" w:hint="cs"/>
+          <w:color w:val="000000" w:themeColor="text1"/>
+          <w:sz w:val="32"/>
+          <w:szCs w:val="32"/>
+          <w:cs/>
+          <w:lang w:val="en-US" w:eastAsia="en-GB"/>
+        </w:rPr>
+        <w:t>ปีการศึกษา</w:t>
+      </w:r>
+      <w:r>
+        <w:rPr>
+          <w:rFonts w:ascii="TH Sarabun New" w:eastAsia="Times New Roman" w:hAnsi="TH Sarabun New" w:cs="TH Sarabun New"/>
+          <w:color w:val="000000" w:themeColor="text1"/>
+          <w:sz w:val="32"/>
+          <w:szCs w:val="32"/>
+          <w:lang w:val="en-US" w:eastAsia="en-GB"/>
+        </w:rPr>
+        <w:t>{{}}</w:t>
+      </w:r>
     </w:p>
     <w:p>
       <w:pPr>
@@ -1121,6 +1267,79 @@
           <w:lang w:val="en-US" w:eastAsia="en-GB"/>
         </w:rPr>
         <w:t>แบบดิจิทัลและอื่นๆ</w:t>
+      </w:r>
+      <w:r>
+        <w:rPr>
+          <w:rFonts w:ascii="TH Sarabun New" w:eastAsia="Times New Roman" w:hAnsi="TH Sarabun New" w:cs="TH Sarabun New"/>
+          <w:color w:val="000000" w:themeColor="text1"/>
+          <w:sz w:val="32"/>
+          <w:szCs w:val="32"/>
+          <w:lang w:val="en-US" w:eastAsia="en-GB"/>
+        </w:rPr>
+        <w:t xml:space="preserve"> </w:t>
+      </w:r>
+      <w:r>
+        <w:rPr>
+          <w:rFonts w:ascii="TH Sarabun New" w:eastAsia="Times New Roman" w:hAnsi="TH Sarabun New" w:cs="TH Sarabun New" w:hint="cs"/>
+          <w:color w:val="000000" w:themeColor="text1"/>
+          <w:sz w:val="32"/>
+          <w:szCs w:val="32"/>
+          <w:cs/>
+          <w:lang w:val="en-US" w:eastAsia="en-GB"/>
+        </w:rPr>
+        <w:t>รายวิชา</w:t>
+      </w:r>
+      <w:r>
+        <w:rPr>
+          <w:rFonts w:ascii="TH Sarabun New" w:eastAsia="Times New Roman" w:hAnsi="TH Sarabun New" w:cs="TH Sarabun New"/>
+          <w:color w:val="000000" w:themeColor="text1"/>
+          <w:sz w:val="32"/>
+          <w:szCs w:val="32"/>
+          <w:lang w:val="en-US" w:eastAsia="en-GB"/>
+        </w:rPr>
+        <w:t>{{}}</w:t>
+      </w:r>
+      <w:r>
+        <w:rPr>
+          <w:rFonts w:ascii="TH Sarabun New" w:eastAsia="Times New Roman" w:hAnsi="TH Sarabun New" w:cs="TH Sarabun New" w:hint="cs"/>
+          <w:color w:val="000000" w:themeColor="text1"/>
+          <w:sz w:val="32"/>
+          <w:szCs w:val="32"/>
+          <w:cs/>
+          <w:lang w:val="en-US" w:eastAsia="en-GB"/>
+        </w:rPr>
+        <w:t>รหัสวิชา</w:t>
+      </w:r>
+      <w:r>
+        <w:rPr>
+          <w:rFonts w:ascii="TH Sarabun New" w:eastAsia="Times New Roman" w:hAnsi="TH Sarabun New" w:cs="TH Sarabun New"/>
+          <w:color w:val="000000" w:themeColor="text1"/>
+          <w:sz w:val="32"/>
+          <w:szCs w:val="32"/>
+          <w:lang w:val="en-US" w:eastAsia="en-GB"/>
+        </w:rPr>
+        <w:t>{{}}</w:t>
+      </w:r>
+      <w:r>
+        <w:rPr>
+          <w:rFonts w:ascii="TH Sarabun New" w:eastAsia="Times New Roman" w:hAnsi="TH Sarabun New" w:cs="TH Sarabun New" w:hint="cs"/>
+          <w:color w:val="000000" w:themeColor="text1"/>
+          <w:sz w:val="32"/>
+          <w:szCs w:val="32"/>
+          <w:cs/>
+          <w:lang w:val="en-US" w:eastAsia="en-GB"/>
+        </w:rPr>
+        <w:t>ปีการศึกษา</w:t>
+      </w:r>
+      <w:r>
+        <w:rPr>
+          <w:rFonts w:ascii="TH Sarabun New" w:eastAsia="Times New Roman" w:hAnsi="TH Sarabun New" w:cs="TH Sarabun New"/>
+          <w:color w:val="000000" w:themeColor="text1"/>
+          <w:sz w:val="32"/>
+          <w:szCs w:val="32"/>
+          <w:lang w:val="en-US" w:eastAsia="en-GB"/>
+        </w:rPr>
+        <w:t>{{}}</w:t>
       </w:r>
     </w:p>
     <w:p>
@@ -1325,29 +1544,7 @@
           <w:szCs w:val="32"/>
           <w:lang w:eastAsia="en-GB"/>
         </w:rPr>
-        <w:t>{{</w:t>
-      </w:r>
-      <w:proofErr w:type="spellStart"/>
-      <w:r>
-        <w:rPr>
-          <w:rFonts w:ascii="TH Sarabun New" w:eastAsia="Times New Roman" w:hAnsi="TH Sarabun New" w:cs="TH Sarabun New"/>
-          <w:color w:val="000000" w:themeColor="text1"/>
-          <w:sz w:val="32"/>
-          <w:szCs w:val="32"/>
-          <w:lang w:eastAsia="en-GB"/>
-        </w:rPr>
-        <w:t>applicant_name_full_print</w:t>
-      </w:r>
-      <w:proofErr w:type="spellEnd"/>
-      <w:r>
-        <w:rPr>
-          <w:rFonts w:ascii="TH Sarabun New" w:eastAsia="Times New Roman" w:hAnsi="TH Sarabun New" w:cs="TH Sarabun New"/>
-          <w:color w:val="000000" w:themeColor="text1"/>
-          <w:sz w:val="32"/>
-          <w:szCs w:val="32"/>
-          <w:lang w:eastAsia="en-GB"/>
-        </w:rPr>
-        <w:t>}}</w:t>
+        <w:t>{{applicant_name_full_print}}</w:t>
       </w:r>
       <w:r>
         <w:rPr>
@@ -1915,7 +2112,7 @@
     <w:lsdException w:name="Unresolved Mention" w:semiHidden="1" w:unhideWhenUsed="1"/>
     <w:lsdException w:name="Smart Link" w:semiHidden="1" w:unhideWhenUsed="1"/>
   </w:latentStyles>
-  <w:style w:type="paragraph" w:default="1" w:styleId="a">
+  <w:style w:type="paragraph" w:default="1" w:styleId="Normal">
     <w:name w:val="Normal"/>
     <w:qFormat/>
     <w:rsid w:val="005D52E8"/>
@@ -1924,11 +2121,11 @@
       <w:szCs w:val="24"/>
     </w:rPr>
   </w:style>
-  <w:style w:type="paragraph" w:styleId="1">
+  <w:style w:type="paragraph" w:styleId="Heading1">
     <w:name w:val="heading 1"/>
-    <w:basedOn w:val="a"/>
-    <w:next w:val="a"/>
-    <w:link w:val="10"/>
+    <w:basedOn w:val="Normal"/>
+    <w:next w:val="Normal"/>
+    <w:link w:val="Heading1Char"/>
     <w:uiPriority w:val="9"/>
     <w:qFormat/>
     <w:rsid w:val="005D52E8"/>
@@ -1946,11 +2143,11 @@
       <w:szCs w:val="32"/>
     </w:rPr>
   </w:style>
-  <w:style w:type="paragraph" w:styleId="2">
+  <w:style w:type="paragraph" w:styleId="Heading2">
     <w:name w:val="heading 2"/>
-    <w:basedOn w:val="a"/>
-    <w:next w:val="a"/>
-    <w:link w:val="20"/>
+    <w:basedOn w:val="Normal"/>
+    <w:next w:val="Normal"/>
+    <w:link w:val="Heading2Char"/>
     <w:uiPriority w:val="9"/>
     <w:semiHidden/>
     <w:unhideWhenUsed/>
@@ -1971,11 +2168,11 @@
       <w:szCs w:val="28"/>
     </w:rPr>
   </w:style>
-  <w:style w:type="paragraph" w:styleId="3">
+  <w:style w:type="paragraph" w:styleId="Heading3">
     <w:name w:val="heading 3"/>
-    <w:basedOn w:val="a"/>
-    <w:next w:val="a"/>
-    <w:link w:val="30"/>
+    <w:basedOn w:val="Normal"/>
+    <w:next w:val="Normal"/>
+    <w:link w:val="Heading3Char"/>
     <w:uiPriority w:val="9"/>
     <w:semiHidden/>
     <w:unhideWhenUsed/>
@@ -1994,11 +2191,11 @@
       <w:szCs w:val="26"/>
     </w:rPr>
   </w:style>
-  <w:style w:type="paragraph" w:styleId="4">
+  <w:style w:type="paragraph" w:styleId="Heading4">
     <w:name w:val="heading 4"/>
-    <w:basedOn w:val="a"/>
-    <w:next w:val="a"/>
-    <w:link w:val="40"/>
+    <w:basedOn w:val="Normal"/>
+    <w:next w:val="Normal"/>
+    <w:link w:val="Heading4Char"/>
     <w:uiPriority w:val="9"/>
     <w:semiHidden/>
     <w:unhideWhenUsed/>
@@ -2016,11 +2213,11 @@
       <w:szCs w:val="28"/>
     </w:rPr>
   </w:style>
-  <w:style w:type="paragraph" w:styleId="5">
+  <w:style w:type="paragraph" w:styleId="Heading5">
     <w:name w:val="heading 5"/>
-    <w:basedOn w:val="a"/>
-    <w:next w:val="a"/>
-    <w:link w:val="50"/>
+    <w:basedOn w:val="Normal"/>
+    <w:next w:val="Normal"/>
+    <w:link w:val="Heading5Char"/>
     <w:uiPriority w:val="9"/>
     <w:semiHidden/>
     <w:unhideWhenUsed/>
@@ -2039,11 +2236,11 @@
       <w:szCs w:val="26"/>
     </w:rPr>
   </w:style>
-  <w:style w:type="paragraph" w:styleId="6">
+  <w:style w:type="paragraph" w:styleId="Heading6">
     <w:name w:val="heading 6"/>
-    <w:basedOn w:val="a"/>
-    <w:next w:val="a"/>
-    <w:link w:val="60"/>
+    <w:basedOn w:val="Normal"/>
+    <w:next w:val="Normal"/>
+    <w:link w:val="Heading6Char"/>
     <w:uiPriority w:val="9"/>
     <w:semiHidden/>
     <w:unhideWhenUsed/>
@@ -2060,11 +2257,11 @@
       <w:szCs w:val="22"/>
     </w:rPr>
   </w:style>
-  <w:style w:type="paragraph" w:styleId="7">
+  <w:style w:type="paragraph" w:styleId="Heading7">
     <w:name w:val="heading 7"/>
-    <w:basedOn w:val="a"/>
-    <w:next w:val="a"/>
-    <w:link w:val="70"/>
+    <w:basedOn w:val="Normal"/>
+    <w:next w:val="Normal"/>
+    <w:link w:val="Heading7Char"/>
     <w:uiPriority w:val="9"/>
     <w:semiHidden/>
     <w:unhideWhenUsed/>
@@ -2075,11 +2272,11 @@
       <w:outlineLvl w:val="6"/>
     </w:pPr>
   </w:style>
-  <w:style w:type="paragraph" w:styleId="8">
+  <w:style w:type="paragraph" w:styleId="Heading8">
     <w:name w:val="heading 8"/>
-    <w:basedOn w:val="a"/>
-    <w:next w:val="a"/>
-    <w:link w:val="80"/>
+    <w:basedOn w:val="Normal"/>
+    <w:next w:val="Normal"/>
+    <w:link w:val="Heading8Char"/>
     <w:uiPriority w:val="9"/>
     <w:semiHidden/>
     <w:unhideWhenUsed/>
@@ -2094,11 +2291,11 @@
       <w:iCs/>
     </w:rPr>
   </w:style>
-  <w:style w:type="paragraph" w:styleId="9">
+  <w:style w:type="paragraph" w:styleId="Heading9">
     <w:name w:val="heading 9"/>
-    <w:basedOn w:val="a"/>
-    <w:next w:val="a"/>
-    <w:link w:val="90"/>
+    <w:basedOn w:val="Normal"/>
+    <w:next w:val="Normal"/>
+    <w:link w:val="Heading9Char"/>
     <w:uiPriority w:val="9"/>
     <w:semiHidden/>
     <w:unhideWhenUsed/>
@@ -2114,12 +2311,13 @@
       <w:szCs w:val="22"/>
     </w:rPr>
   </w:style>
-  <w:style w:type="character" w:default="1" w:styleId="a0">
+  <w:style w:type="character" w:default="1" w:styleId="DefaultParagraphFont">
     <w:name w:val="Default Paragraph Font"/>
     <w:uiPriority w:val="1"/>
+    <w:semiHidden/>
     <w:unhideWhenUsed/>
   </w:style>
-  <w:style w:type="table" w:default="1" w:styleId="a1">
+  <w:style w:type="table" w:default="1" w:styleId="TableNormal">
     <w:name w:val="Normal Table"/>
     <w:uiPriority w:val="99"/>
     <w:semiHidden/>
@@ -2134,15 +2332,15 @@
       </w:tblCellMar>
     </w:tblPr>
   </w:style>
-  <w:style w:type="numbering" w:default="1" w:styleId="a2">
+  <w:style w:type="numbering" w:default="1" w:styleId="NoList">
     <w:name w:val="No List"/>
     <w:uiPriority w:val="99"/>
     <w:semiHidden/>
     <w:unhideWhenUsed/>
   </w:style>
-  <w:style w:type="paragraph" w:styleId="a3">
+  <w:style w:type="paragraph" w:styleId="NormalWeb">
     <w:name w:val="Normal (Web)"/>
-    <w:basedOn w:val="a"/>
+    <w:basedOn w:val="Normal"/>
     <w:uiPriority w:val="99"/>
     <w:semiHidden/>
     <w:unhideWhenUsed/>
@@ -2157,13 +2355,13 @@
   </w:style>
   <w:style w:type="character" w:customStyle="1" w:styleId="apple-tab-span">
     <w:name w:val="apple-tab-span"/>
-    <w:basedOn w:val="a0"/>
+    <w:basedOn w:val="DefaultParagraphFont"/>
     <w:rsid w:val="000463DB"/>
   </w:style>
-  <w:style w:type="paragraph" w:styleId="a4">
+  <w:style w:type="paragraph" w:styleId="BalloonText">
     <w:name w:val="Balloon Text"/>
-    <w:basedOn w:val="a"/>
-    <w:link w:val="a5"/>
+    <w:basedOn w:val="Normal"/>
+    <w:link w:val="BalloonTextChar"/>
     <w:uiPriority w:val="99"/>
     <w:semiHidden/>
     <w:unhideWhenUsed/>
@@ -2174,10 +2372,10 @@
       <w:szCs w:val="22"/>
     </w:rPr>
   </w:style>
-  <w:style w:type="character" w:customStyle="1" w:styleId="a5">
-    <w:name w:val="ข้อความบอลลูน อักขระ"/>
-    <w:basedOn w:val="a0"/>
-    <w:link w:val="a4"/>
+  <w:style w:type="character" w:customStyle="1" w:styleId="BalloonTextChar">
+    <w:name w:val="Balloon Text Char"/>
+    <w:basedOn w:val="DefaultParagraphFont"/>
+    <w:link w:val="BalloonText"/>
     <w:uiPriority w:val="99"/>
     <w:semiHidden/>
     <w:rsid w:val="000C52FD"/>
@@ -2187,10 +2385,10 @@
       <w:szCs w:val="22"/>
     </w:rPr>
   </w:style>
-  <w:style w:type="paragraph" w:styleId="a6">
+  <w:style w:type="paragraph" w:styleId="Header">
     <w:name w:val="header"/>
-    <w:basedOn w:val="a"/>
-    <w:link w:val="a7"/>
+    <w:basedOn w:val="Normal"/>
+    <w:link w:val="HeaderChar"/>
     <w:uiPriority w:val="99"/>
     <w:unhideWhenUsed/>
     <w:rsid w:val="002E55A6"/>
@@ -2201,17 +2399,17 @@
       </w:tabs>
     </w:pPr>
   </w:style>
-  <w:style w:type="character" w:customStyle="1" w:styleId="a7">
-    <w:name w:val="หัวกระดาษ อักขระ"/>
-    <w:basedOn w:val="a0"/>
-    <w:link w:val="a6"/>
+  <w:style w:type="character" w:customStyle="1" w:styleId="HeaderChar">
+    <w:name w:val="Header Char"/>
+    <w:basedOn w:val="DefaultParagraphFont"/>
+    <w:link w:val="Header"/>
     <w:uiPriority w:val="99"/>
     <w:rsid w:val="002E55A6"/>
   </w:style>
-  <w:style w:type="paragraph" w:styleId="a8">
+  <w:style w:type="paragraph" w:styleId="Footer">
     <w:name w:val="footer"/>
-    <w:basedOn w:val="a"/>
-    <w:link w:val="a9"/>
+    <w:basedOn w:val="Normal"/>
+    <w:link w:val="FooterChar"/>
     <w:uiPriority w:val="99"/>
     <w:unhideWhenUsed/>
     <w:rsid w:val="002E55A6"/>
@@ -2222,17 +2420,17 @@
       </w:tabs>
     </w:pPr>
   </w:style>
-  <w:style w:type="character" w:customStyle="1" w:styleId="a9">
-    <w:name w:val="ท้ายกระดาษ อักขระ"/>
-    <w:basedOn w:val="a0"/>
-    <w:link w:val="a8"/>
+  <w:style w:type="character" w:customStyle="1" w:styleId="FooterChar">
+    <w:name w:val="Footer Char"/>
+    <w:basedOn w:val="DefaultParagraphFont"/>
+    <w:link w:val="Footer"/>
     <w:uiPriority w:val="99"/>
     <w:rsid w:val="002E55A6"/>
   </w:style>
-  <w:style w:type="character" w:customStyle="1" w:styleId="10">
-    <w:name w:val="หัวเรื่อง 1 อักขระ"/>
-    <w:basedOn w:val="a0"/>
-    <w:link w:val="1"/>
+  <w:style w:type="character" w:customStyle="1" w:styleId="Heading1Char">
+    <w:name w:val="Heading 1 Char"/>
+    <w:basedOn w:val="DefaultParagraphFont"/>
+    <w:link w:val="Heading1"/>
     <w:uiPriority w:val="9"/>
     <w:rsid w:val="005D52E8"/>
     <w:rPr>
@@ -2244,10 +2442,10 @@
       <w:szCs w:val="32"/>
     </w:rPr>
   </w:style>
-  <w:style w:type="character" w:customStyle="1" w:styleId="20">
-    <w:name w:val="หัวเรื่อง 2 อักขระ"/>
-    <w:basedOn w:val="a0"/>
-    <w:link w:val="2"/>
+  <w:style w:type="character" w:customStyle="1" w:styleId="Heading2Char">
+    <w:name w:val="Heading 2 Char"/>
+    <w:basedOn w:val="DefaultParagraphFont"/>
+    <w:link w:val="Heading2"/>
     <w:uiPriority w:val="9"/>
     <w:semiHidden/>
     <w:rsid w:val="005D52E8"/>
@@ -2261,10 +2459,10 @@
       <w:szCs w:val="28"/>
     </w:rPr>
   </w:style>
-  <w:style w:type="character" w:customStyle="1" w:styleId="30">
-    <w:name w:val="หัวเรื่อง 3 อักขระ"/>
-    <w:basedOn w:val="a0"/>
-    <w:link w:val="3"/>
+  <w:style w:type="character" w:customStyle="1" w:styleId="Heading3Char">
+    <w:name w:val="Heading 3 Char"/>
+    <w:basedOn w:val="DefaultParagraphFont"/>
+    <w:link w:val="Heading3"/>
     <w:uiPriority w:val="9"/>
     <w:semiHidden/>
     <w:rsid w:val="005D52E8"/>
@@ -2276,10 +2474,10 @@
       <w:szCs w:val="26"/>
     </w:rPr>
   </w:style>
-  <w:style w:type="character" w:customStyle="1" w:styleId="40">
-    <w:name w:val="หัวเรื่อง 4 อักขระ"/>
-    <w:basedOn w:val="a0"/>
-    <w:link w:val="4"/>
+  <w:style w:type="character" w:customStyle="1" w:styleId="Heading4Char">
+    <w:name w:val="Heading 4 Char"/>
+    <w:basedOn w:val="DefaultParagraphFont"/>
+    <w:link w:val="Heading4"/>
     <w:uiPriority w:val="9"/>
     <w:semiHidden/>
     <w:rsid w:val="005D52E8"/>
@@ -2290,10 +2488,10 @@
       <w:szCs w:val="28"/>
     </w:rPr>
   </w:style>
-  <w:style w:type="character" w:customStyle="1" w:styleId="50">
-    <w:name w:val="หัวเรื่อง 5 อักขระ"/>
-    <w:basedOn w:val="a0"/>
-    <w:link w:val="5"/>
+  <w:style w:type="character" w:customStyle="1" w:styleId="Heading5Char">
+    <w:name w:val="Heading 5 Char"/>
+    <w:basedOn w:val="DefaultParagraphFont"/>
+    <w:link w:val="Heading5"/>
     <w:uiPriority w:val="9"/>
     <w:semiHidden/>
     <w:rsid w:val="005D52E8"/>
@@ -2306,10 +2504,10 @@
       <w:szCs w:val="26"/>
     </w:rPr>
   </w:style>
-  <w:style w:type="character" w:customStyle="1" w:styleId="60">
-    <w:name w:val="หัวเรื่อง 6 อักขระ"/>
-    <w:basedOn w:val="a0"/>
-    <w:link w:val="6"/>
+  <w:style w:type="character" w:customStyle="1" w:styleId="Heading6Char">
+    <w:name w:val="Heading 6 Char"/>
+    <w:basedOn w:val="DefaultParagraphFont"/>
+    <w:link w:val="Heading6"/>
     <w:uiPriority w:val="9"/>
     <w:semiHidden/>
     <w:rsid w:val="005D52E8"/>
@@ -2318,10 +2516,10 @@
       <w:bCs/>
     </w:rPr>
   </w:style>
-  <w:style w:type="character" w:customStyle="1" w:styleId="70">
-    <w:name w:val="หัวเรื่อง 7 อักขระ"/>
-    <w:basedOn w:val="a0"/>
-    <w:link w:val="7"/>
+  <w:style w:type="character" w:customStyle="1" w:styleId="Heading7Char">
+    <w:name w:val="Heading 7 Char"/>
+    <w:basedOn w:val="DefaultParagraphFont"/>
+    <w:link w:val="Heading7"/>
     <w:uiPriority w:val="9"/>
     <w:semiHidden/>
     <w:rsid w:val="005D52E8"/>
@@ -2330,10 +2528,10 @@
       <w:szCs w:val="24"/>
     </w:rPr>
   </w:style>
-  <w:style w:type="character" w:customStyle="1" w:styleId="80">
-    <w:name w:val="หัวเรื่อง 8 อักขระ"/>
-    <w:basedOn w:val="a0"/>
-    <w:link w:val="8"/>
+  <w:style w:type="character" w:customStyle="1" w:styleId="Heading8Char">
+    <w:name w:val="Heading 8 Char"/>
+    <w:basedOn w:val="DefaultParagraphFont"/>
+    <w:link w:val="Heading8"/>
     <w:uiPriority w:val="9"/>
     <w:semiHidden/>
     <w:rsid w:val="005D52E8"/>
@@ -2344,10 +2542,10 @@
       <w:szCs w:val="24"/>
     </w:rPr>
   </w:style>
-  <w:style w:type="character" w:customStyle="1" w:styleId="90">
-    <w:name w:val="หัวเรื่อง 9 อักขระ"/>
-    <w:basedOn w:val="a0"/>
-    <w:link w:val="9"/>
+  <w:style w:type="character" w:customStyle="1" w:styleId="Heading9Char">
+    <w:name w:val="Heading 9 Char"/>
+    <w:basedOn w:val="DefaultParagraphFont"/>
+    <w:link w:val="Heading9"/>
     <w:uiPriority w:val="9"/>
     <w:semiHidden/>
     <w:rsid w:val="005D52E8"/>
@@ -2355,11 +2553,11 @@
       <w:rFonts w:asciiTheme="majorHAnsi" w:eastAsiaTheme="majorEastAsia" w:hAnsiTheme="majorHAnsi"/>
     </w:rPr>
   </w:style>
-  <w:style w:type="paragraph" w:styleId="aa">
+  <w:style w:type="paragraph" w:styleId="Title">
     <w:name w:val="Title"/>
-    <w:basedOn w:val="a"/>
-    <w:next w:val="a"/>
-    <w:link w:val="ab"/>
+    <w:basedOn w:val="Normal"/>
+    <w:next w:val="Normal"/>
+    <w:link w:val="TitleChar"/>
     <w:uiPriority w:val="10"/>
     <w:qFormat/>
     <w:rsid w:val="005D52E8"/>
@@ -2377,10 +2575,10 @@
       <w:szCs w:val="32"/>
     </w:rPr>
   </w:style>
-  <w:style w:type="character" w:customStyle="1" w:styleId="ab">
-    <w:name w:val="ชื่อเรื่อง อักขระ"/>
-    <w:basedOn w:val="a0"/>
-    <w:link w:val="aa"/>
+  <w:style w:type="character" w:customStyle="1" w:styleId="TitleChar">
+    <w:name w:val="Title Char"/>
+    <w:basedOn w:val="DefaultParagraphFont"/>
+    <w:link w:val="Title"/>
     <w:uiPriority w:val="10"/>
     <w:rsid w:val="005D52E8"/>
     <w:rPr>
@@ -2392,11 +2590,11 @@
       <w:szCs w:val="32"/>
     </w:rPr>
   </w:style>
-  <w:style w:type="paragraph" w:styleId="ac">
+  <w:style w:type="paragraph" w:styleId="Subtitle">
     <w:name w:val="Subtitle"/>
-    <w:basedOn w:val="a"/>
-    <w:next w:val="a"/>
-    <w:link w:val="ad"/>
+    <w:basedOn w:val="Normal"/>
+    <w:next w:val="Normal"/>
+    <w:link w:val="SubtitleChar"/>
     <w:uiPriority w:val="11"/>
     <w:qFormat/>
     <w:rsid w:val="005D52E8"/>
@@ -2409,10 +2607,10 @@
       <w:rFonts w:asciiTheme="majorHAnsi" w:eastAsiaTheme="majorEastAsia" w:hAnsiTheme="majorHAnsi"/>
     </w:rPr>
   </w:style>
-  <w:style w:type="character" w:customStyle="1" w:styleId="ad">
-    <w:name w:val="ชื่อเรื่องรอง อักขระ"/>
-    <w:basedOn w:val="a0"/>
-    <w:link w:val="ac"/>
+  <w:style w:type="character" w:customStyle="1" w:styleId="SubtitleChar">
+    <w:name w:val="Subtitle Char"/>
+    <w:basedOn w:val="DefaultParagraphFont"/>
+    <w:link w:val="Subtitle"/>
     <w:uiPriority w:val="11"/>
     <w:rsid w:val="005D52E8"/>
     <w:rPr>
@@ -2421,9 +2619,9 @@
       <w:szCs w:val="24"/>
     </w:rPr>
   </w:style>
-  <w:style w:type="character" w:styleId="ae">
+  <w:style w:type="character" w:styleId="Strong">
     <w:name w:val="Strong"/>
-    <w:basedOn w:val="a0"/>
+    <w:basedOn w:val="DefaultParagraphFont"/>
     <w:uiPriority w:val="22"/>
     <w:qFormat/>
     <w:rsid w:val="005D52E8"/>
@@ -2432,9 +2630,9 @@
       <w:bCs/>
     </w:rPr>
   </w:style>
-  <w:style w:type="character" w:styleId="af">
+  <w:style w:type="character" w:styleId="Emphasis">
     <w:name w:val="Emphasis"/>
-    <w:basedOn w:val="a0"/>
+    <w:basedOn w:val="DefaultParagraphFont"/>
     <w:uiPriority w:val="20"/>
     <w:qFormat/>
     <w:rsid w:val="005D52E8"/>
@@ -2445,9 +2643,9 @@
       <w:iCs/>
     </w:rPr>
   </w:style>
-  <w:style w:type="paragraph" w:styleId="af0">
+  <w:style w:type="paragraph" w:styleId="NoSpacing">
     <w:name w:val="No Spacing"/>
-    <w:basedOn w:val="a"/>
+    <w:basedOn w:val="Normal"/>
     <w:uiPriority w:val="1"/>
     <w:qFormat/>
     <w:rsid w:val="005D52E8"/>
@@ -2455,9 +2653,9 @@
       <w:szCs w:val="32"/>
     </w:rPr>
   </w:style>
-  <w:style w:type="paragraph" w:styleId="af1">
+  <w:style w:type="paragraph" w:styleId="ListParagraph">
     <w:name w:val="List Paragraph"/>
-    <w:basedOn w:val="a"/>
+    <w:basedOn w:val="Normal"/>
     <w:uiPriority w:val="34"/>
     <w:qFormat/>
     <w:rsid w:val="005D52E8"/>
@@ -2466,11 +2664,11 @@
       <w:contextualSpacing/>
     </w:pPr>
   </w:style>
-  <w:style w:type="paragraph" w:styleId="af2">
+  <w:style w:type="paragraph" w:styleId="Quote">
     <w:name w:val="Quote"/>
-    <w:basedOn w:val="a"/>
-    <w:next w:val="a"/>
-    <w:link w:val="af3"/>
+    <w:basedOn w:val="Normal"/>
+    <w:next w:val="Normal"/>
+    <w:link w:val="QuoteChar"/>
     <w:uiPriority w:val="29"/>
     <w:qFormat/>
     <w:rsid w:val="005D52E8"/>
@@ -2478,10 +2676,10 @@
       <w:i/>
     </w:rPr>
   </w:style>
-  <w:style w:type="character" w:customStyle="1" w:styleId="af3">
-    <w:name w:val="คำอ้างอิง อักขระ"/>
-    <w:basedOn w:val="a0"/>
-    <w:link w:val="af2"/>
+  <w:style w:type="character" w:customStyle="1" w:styleId="QuoteChar">
+    <w:name w:val="Quote Char"/>
+    <w:basedOn w:val="DefaultParagraphFont"/>
+    <w:link w:val="Quote"/>
     <w:uiPriority w:val="29"/>
     <w:rsid w:val="005D52E8"/>
     <w:rPr>
@@ -2490,11 +2688,11 @@
       <w:szCs w:val="24"/>
     </w:rPr>
   </w:style>
-  <w:style w:type="paragraph" w:styleId="af4">
+  <w:style w:type="paragraph" w:styleId="IntenseQuote">
     <w:name w:val="Intense Quote"/>
-    <w:basedOn w:val="a"/>
-    <w:next w:val="a"/>
-    <w:link w:val="af5"/>
+    <w:basedOn w:val="Normal"/>
+    <w:next w:val="Normal"/>
+    <w:link w:val="IntenseQuoteChar"/>
     <w:uiPriority w:val="30"/>
     <w:qFormat/>
     <w:rsid w:val="005D52E8"/>
@@ -2507,10 +2705,10 @@
       <w:szCs w:val="22"/>
     </w:rPr>
   </w:style>
-  <w:style w:type="character" w:customStyle="1" w:styleId="af5">
-    <w:name w:val="ทำให้คำอ้างอิงเป็นสีเข้มขึ้น อักขระ"/>
-    <w:basedOn w:val="a0"/>
-    <w:link w:val="af4"/>
+  <w:style w:type="character" w:customStyle="1" w:styleId="IntenseQuoteChar">
+    <w:name w:val="Intense Quote Char"/>
+    <w:basedOn w:val="DefaultParagraphFont"/>
+    <w:link w:val="IntenseQuote"/>
     <w:uiPriority w:val="30"/>
     <w:rsid w:val="005D52E8"/>
     <w:rPr>
@@ -2519,7 +2717,7 @@
       <w:sz w:val="24"/>
     </w:rPr>
   </w:style>
-  <w:style w:type="character" w:styleId="af6">
+  <w:style w:type="character" w:styleId="SubtleEmphasis">
     <w:name w:val="Subtle Emphasis"/>
     <w:uiPriority w:val="19"/>
     <w:qFormat/>
@@ -2529,9 +2727,9 @@
       <w:color w:val="5A5A5A" w:themeColor="text1" w:themeTint="A5"/>
     </w:rPr>
   </w:style>
-  <w:style w:type="character" w:styleId="af7">
+  <w:style w:type="character" w:styleId="IntenseEmphasis">
     <w:name w:val="Intense Emphasis"/>
-    <w:basedOn w:val="a0"/>
+    <w:basedOn w:val="DefaultParagraphFont"/>
     <w:uiPriority w:val="21"/>
     <w:qFormat/>
     <w:rsid w:val="005D52E8"/>
@@ -2543,9 +2741,9 @@
       <w:u w:val="single"/>
     </w:rPr>
   </w:style>
-  <w:style w:type="character" w:styleId="af8">
+  <w:style w:type="character" w:styleId="SubtleReference">
     <w:name w:val="Subtle Reference"/>
-    <w:basedOn w:val="a0"/>
+    <w:basedOn w:val="DefaultParagraphFont"/>
     <w:uiPriority w:val="31"/>
     <w:qFormat/>
     <w:rsid w:val="005D52E8"/>
@@ -2555,9 +2753,9 @@
       <w:u w:val="single"/>
     </w:rPr>
   </w:style>
-  <w:style w:type="character" w:styleId="af9">
+  <w:style w:type="character" w:styleId="IntenseReference">
     <w:name w:val="Intense Reference"/>
-    <w:basedOn w:val="a0"/>
+    <w:basedOn w:val="DefaultParagraphFont"/>
     <w:uiPriority w:val="32"/>
     <w:qFormat/>
     <w:rsid w:val="005D52E8"/>
@@ -2567,9 +2765,9 @@
       <w:u w:val="single"/>
     </w:rPr>
   </w:style>
-  <w:style w:type="character" w:styleId="afa">
+  <w:style w:type="character" w:styleId="BookTitle">
     <w:name w:val="Book Title"/>
-    <w:basedOn w:val="a0"/>
+    <w:basedOn w:val="DefaultParagraphFont"/>
     <w:uiPriority w:val="33"/>
     <w:qFormat/>
     <w:rsid w:val="005D52E8"/>
@@ -2581,10 +2779,10 @@
       <w:szCs w:val="24"/>
     </w:rPr>
   </w:style>
-  <w:style w:type="paragraph" w:styleId="afb">
+  <w:style w:type="paragraph" w:styleId="TOCHeading">
     <w:name w:val="TOC Heading"/>
-    <w:basedOn w:val="1"/>
-    <w:next w:val="a"/>
+    <w:basedOn w:val="Heading1"/>
+    <w:next w:val="Normal"/>
     <w:uiPriority w:val="39"/>
     <w:semiHidden/>
     <w:unhideWhenUsed/>
@@ -2594,9 +2792,9 @@
       <w:outlineLvl w:val="9"/>
     </w:pPr>
   </w:style>
-  <w:style w:type="table" w:styleId="afc">
+  <w:style w:type="table" w:styleId="TableGrid">
     <w:name w:val="Table Grid"/>
-    <w:basedOn w:val="a1"/>
+    <w:basedOn w:val="TableNormal"/>
     <w:uiPriority w:val="39"/>
     <w:rsid w:val="005E088A"/>
     <w:tblPr>

</xml_diff>